<commit_message>
docs: Add AILuminate validation, expand runtime auditable governance
- Update validation counts: 1,350 → 2,550 attacks (added AILuminate 1,200)
- Add dedicated Runtime Auditable Governance sections to papers
- Expand Section 6 (Academic Paper) with forensic trace architecture
- Expand Section 6.4 (Whitepaper) with GovernanceTraceCollector details
- Add forensic evidence tables (11,208 events across 5 benchmarks)
- Document regulatory alignment (EU AI Act, CA SB 53, HIPAA, ISO 27001)
- Update README with Runtime Auditable Governance section
- Regenerate all document formats (.tex, .docx, .pdf)

🤖 Generated with [Claude Code](https://claude.com/claude-code)

Co-Authored-By: Claude <noreply@anthropic.com>
</commit_message>
<xml_diff>
--- a/docs/TELOS_Whitepaper_v2.4.docx
+++ b/docs/TELOS_Whitepaper_v2.4.docx
@@ -2,7 +2,7 @@
 <file path=word/document.xml><?xml version="1.0" encoding="utf-8"?>
 <w:document xmlns:w="http://schemas.openxmlformats.org/wordprocessingml/2006/main" xmlns:m="http://schemas.openxmlformats.org/officeDocument/2006/math" xmlns:r="http://schemas.openxmlformats.org/officeDocument/2006/relationships" xmlns:o="urn:schemas-microsoft-com:office:office" xmlns:v="urn:schemas-microsoft-com:vml" xmlns:w10="urn:schemas-microsoft-com:office:word" xmlns:a="http://schemas.openxmlformats.org/drawingml/2006/main" xmlns:pic="http://schemas.openxmlformats.org/drawingml/2006/picture" xmlns:wp="http://schemas.openxmlformats.org/drawingml/2006/wordprocessingDrawing">
   <w:body>
-    <w:bookmarkStart w:id="138" w:name="Xe337f85ccb5db6de0562211e74a4b5f0eb52d11"/>
+    <w:bookmarkStart w:id="143" w:name="Xe337f85ccb5db6de0562211e74a4b5f0eb52d11"/>
     <w:p>
       <w:pPr>
         <w:pStyle w:val="Heading1"/>
@@ -62,7 +62,7 @@
         <w:pStyle w:val="BodyText"/>
       </w:pPr>
       <w:r>
-        <w:t xml:space="preserve">TELOS operates as orchestration-layer infrastructure that measures every AI response against human-defined constitutional constraints (Primacy Attractors), detects drift mathematically, and applies proportional corrections in real-time. Security testing demonstrates 0% attack success rate across 1,350 adversarial scenarios spanning four benchmarks: HarmBench (400 general-purpose), MedSafetyBench (900 healthcare-specific), and California SB 243 Child Safety (50 CSAM-aligned attacks)—representing 100% attack elimination compared to standard prompt-based defenses (3.7-11.1% ASR). XSTest over-refusal calibration shows domain-specific Primacy Attractors reduce false positive rates from 24.8% (generic) to 8.0% (Healthcare PA), demonstrating that TELOS achieves strong safety without excessive restriction. With California’s SB 53 taking effect January 2026 and EU AI Act enforcement beginning August 2026, TELOS provides the continuous monitoring infrastructure that emerging regulations explicitly require.</w:t>
+        <w:t xml:space="preserve">TELOS operates as orchestration-layer infrastructure that measures every AI response against human-defined constitutional constraints (Primacy Attractors), detects drift mathematically, and applies proportional corrections in real-time. Security testing demonstrates 0% attack success rate across 2,550 adversarial scenarios spanning five benchmarks: AILuminate (1,200 MLCommons industry-standard), HarmBench (400 general-purpose), MedSafetyBench (900 healthcare-specific), and California SB 243 Child Safety (50 CSAM-aligned attacks)—representing 100% attack elimination compared to standard prompt-based defenses (3.7-11.1% ASR). XSTest over-refusal calibration shows domain-specific Primacy Attractors reduce false positive rates from 24.8% (generic) to 8.0% (Healthcare PA), demonstrating that TELOS achieves strong safety without excessive restriction. With California’s SB 53 taking effect January 2026 and EU AI Act enforcement beginning August 2026, TELOS provides the continuous monitoring infrastructure that emerging regulations explicitly require.</w:t>
       </w:r>
     </w:p>
     <w:p>
@@ -186,7 +186,7 @@
         <w:t xml:space="preserve">Adversarial Validation (December 2025 - January 2026)</w:t>
       </w:r>
       <w:r>
-        <w:t xml:space="preserve">: Security testing across 1,350 adversarial attacks demonstrates</w:t>
+        <w:t xml:space="preserve">: Security testing across 2,550 adversarial attacks demonstrates</w:t>
       </w:r>
       <w:r>
         <w:t xml:space="preserve"> </w:t>
@@ -218,7 +218,7 @@
         <w:t xml:space="preserve"> </w:t>
       </w:r>
       <w:r>
-        <w:t xml:space="preserve">through orchestration-layer governance. Testing spans four established benchmarks: HarmBench (400 general-purpose attacks from Center for AI Safety), MedSafetyBench (900 healthcare-specific attacks from NeurIPS 2024), and California SB 243 Child Safety (50 CSAM-aligned attacks). TELOS achieved perfect defense (0/1,350 attacks succeeded) while system prompt baselines allowed attacks through.</w:t>
+        <w:t xml:space="preserve">through orchestration-layer governance. Testing spans five established benchmarks: AILuminate (1,200 MLCommons industry-standard attacks), HarmBench (400 general-purpose attacks from Center for AI Safety), MedSafetyBench (900 healthcare-specific attacks from NeurIPS 2024), and California SB 243 Child Safety (50 CSAM-aligned attacks). TELOS achieved perfect defense (0/2,550 attacks succeeded) while system prompt baselines allowed attacks through.</w:t>
       </w:r>
       <w:r>
         <w:t xml:space="preserve"> </w:t>
@@ -11866,7 +11866,7 @@
         <w:t xml:space="preserve">Status</w:t>
       </w:r>
       <w:r>
-        <w:t xml:space="preserve">: ✅ VALIDATED (0% ASR vs 3.7-11.1% baseline across 1,350 attacks including SB 243 child safety)</w:t>
+        <w:t xml:space="preserve">: ✅ VALIDATED (0% ASR vs 3.7-11.1% baseline across 2,550 attacks including AILuminate and SB 243 child safety)</w:t>
       </w:r>
     </w:p>
     <w:p>
@@ -12014,7 +12014,7 @@
         <w:t xml:space="preserve">Status</w:t>
       </w:r>
       <w:r>
-        <w:t xml:space="preserve">: ✅ VALIDATED (1,350 attacks: 400 HarmBench + 900 MedSafetyBench + 50 SB 243, across 2 models)</w:t>
+        <w:t xml:space="preserve">: ✅ VALIDATED (2,550 attacks: 1,200 AILuminate + 400 HarmBench + 900 MedSafetyBench + 50 SB 243)</w:t>
       </w:r>
     </w:p>
     <w:p>
@@ -16602,13 +16602,13 @@
       </w:r>
     </w:p>
     <w:bookmarkEnd w:id="82"/>
-    <w:bookmarkStart w:id="83" w:name="telemetry-evidence-generation-for-audit"/>
+    <w:bookmarkStart w:id="83" w:name="X86e8aa8ebe594f3f4bd5173ec20193baad73b29"/>
     <w:p>
       <w:pPr>
         <w:pStyle w:val="Heading3"/>
       </w:pPr>
       <w:r>
-        <w:t xml:space="preserve">6.4 Telemetry: Evidence Generation for Audit</w:t>
+        <w:t xml:space="preserve">6.4 Runtime Auditable Governance: The GovernanceTraceCollector</w:t>
       </w:r>
     </w:p>
     <w:p>
@@ -16616,7 +16616,357 @@
         <w:pStyle w:val="FirstParagraph"/>
       </w:pPr>
       <w:r>
-        <w:t xml:space="preserve">Every interaction generates comprehensive telemetry:</w:t>
+        <w:t xml:space="preserve">TELOS produces audit records at the moment of each governance decision—not post-hoc explanations generated after the fact. When regulators examine an incident, they can trace exactly what the system measured, what thresholds applied, and why a particular intervention occurred.</w:t>
+      </w:r>
+    </w:p>
+    <w:p>
+      <w:pPr>
+        <w:pStyle w:val="BodyText"/>
+      </w:pPr>
+      <w:r>
+        <w:rPr>
+          <w:b/>
+          <w:bCs/>
+        </w:rPr>
+        <w:t xml:space="preserve">The GovernanceTraceCollector</w:t>
+      </w:r>
+      <w:r>
+        <w:t xml:space="preserve"> </w:t>
+      </w:r>
+      <w:r>
+        <w:t xml:space="preserve">records seven event types for each session:</w:t>
+      </w:r>
+    </w:p>
+    <w:tbl>
+      <w:tblPr>
+        <w:tblStyle w:val="Table"/>
+        <w:tblW w:type="pct" w:w="5000"/>
+        <w:tblLayout w:type="fixed"/>
+        <w:tblLook w:firstRow="1" w:lastRow="0" w:firstColumn="0" w:lastColumn="0" w:noHBand="0" w:noVBand="0" w:val="0020"/>
+      </w:tblPr>
+      <w:tblGrid>
+        <w:gridCol w:w="3065"/>
+        <w:gridCol w:w="2554"/>
+        <w:gridCol w:w="2299"/>
+      </w:tblGrid>
+      <w:tr>
+        <w:trPr>
+          <w:tblHeader w:val="on"/>
+        </w:trPr>
+        <w:tc>
+          <w:tcPr/>
+          <w:p>
+            <w:pPr>
+              <w:pStyle w:val="Compact"/>
+            </w:pPr>
+            <w:r>
+              <w:t xml:space="preserve">Event Type</w:t>
+            </w:r>
+          </w:p>
+        </w:tc>
+        <w:tc>
+          <w:tcPr/>
+          <w:p>
+            <w:pPr>
+              <w:pStyle w:val="Compact"/>
+            </w:pPr>
+            <w:r>
+              <w:t xml:space="preserve">Contents</w:t>
+            </w:r>
+          </w:p>
+        </w:tc>
+        <w:tc>
+          <w:tcPr/>
+          <w:p>
+            <w:pPr>
+              <w:pStyle w:val="Compact"/>
+            </w:pPr>
+            <w:r>
+              <w:t xml:space="preserve">Purpose</w:t>
+            </w:r>
+          </w:p>
+        </w:tc>
+      </w:tr>
+      <w:tr>
+        <w:tc>
+          <w:tcPr/>
+          <w:p>
+            <w:pPr>
+              <w:pStyle w:val="Compact"/>
+            </w:pPr>
+            <w:r>
+              <w:rPr>
+                <w:rStyle w:val="VerbatimChar"/>
+              </w:rPr>
+              <w:t xml:space="preserve">session_start</w:t>
+            </w:r>
+          </w:p>
+        </w:tc>
+        <w:tc>
+          <w:tcPr/>
+          <w:p>
+            <w:pPr>
+              <w:pStyle w:val="Compact"/>
+            </w:pPr>
+            <w:r>
+              <w:t xml:space="preserve">Session ID, timestamp, PA configuration</w:t>
+            </w:r>
+          </w:p>
+        </w:tc>
+        <w:tc>
+          <w:tcPr/>
+          <w:p>
+            <w:pPr>
+              <w:pStyle w:val="Compact"/>
+            </w:pPr>
+            <w:r>
+              <w:t xml:space="preserve">Establishes governance context</w:t>
+            </w:r>
+          </w:p>
+        </w:tc>
+      </w:tr>
+      <w:tr>
+        <w:tc>
+          <w:tcPr/>
+          <w:p>
+            <w:pPr>
+              <w:pStyle w:val="Compact"/>
+            </w:pPr>
+            <w:r>
+              <w:rPr>
+                <w:rStyle w:val="VerbatimChar"/>
+              </w:rPr>
+              <w:t xml:space="preserve">pa_established</w:t>
+            </w:r>
+          </w:p>
+        </w:tc>
+        <w:tc>
+          <w:tcPr/>
+          <w:p>
+            <w:pPr>
+              <w:pStyle w:val="Compact"/>
+            </w:pPr>
+            <w:r>
+              <w:t xml:space="preserve">Full PA vector, thresholds, domain</w:t>
+            </w:r>
+          </w:p>
+        </w:tc>
+        <w:tc>
+          <w:tcPr/>
+          <w:p>
+            <w:pPr>
+              <w:pStyle w:val="Compact"/>
+            </w:pPr>
+            <w:r>
+              <w:t xml:space="preserve">Documents constitutional constraints in effect</w:t>
+            </w:r>
+          </w:p>
+        </w:tc>
+      </w:tr>
+      <w:tr>
+        <w:tc>
+          <w:tcPr/>
+          <w:p>
+            <w:pPr>
+              <w:pStyle w:val="Compact"/>
+            </w:pPr>
+            <w:r>
+              <w:rPr>
+                <w:rStyle w:val="VerbatimChar"/>
+              </w:rPr>
+              <w:t xml:space="preserve">turn_start</w:t>
+            </w:r>
+          </w:p>
+        </w:tc>
+        <w:tc>
+          <w:tcPr/>
+          <w:p>
+            <w:pPr>
+              <w:pStyle w:val="Compact"/>
+            </w:pPr>
+            <w:r>
+              <w:t xml:space="preserve">User input, turn number</w:t>
+            </w:r>
+          </w:p>
+        </w:tc>
+        <w:tc>
+          <w:tcPr/>
+          <w:p>
+            <w:pPr>
+              <w:pStyle w:val="Compact"/>
+            </w:pPr>
+            <w:r>
+              <w:t xml:space="preserve">Marks each evaluation cycle</w:t>
+            </w:r>
+          </w:p>
+        </w:tc>
+      </w:tr>
+      <w:tr>
+        <w:tc>
+          <w:tcPr/>
+          <w:p>
+            <w:pPr>
+              <w:pStyle w:val="Compact"/>
+            </w:pPr>
+            <w:r>
+              <w:rPr>
+                <w:rStyle w:val="VerbatimChar"/>
+              </w:rPr>
+              <w:t xml:space="preserve">fidelity_calculated</w:t>
+            </w:r>
+          </w:p>
+        </w:tc>
+        <w:tc>
+          <w:tcPr/>
+          <w:p>
+            <w:pPr>
+              <w:pStyle w:val="Compact"/>
+            </w:pPr>
+            <w:r>
+              <w:t xml:space="preserve">Raw similarity, normalized fidelity, embedding dimensions</w:t>
+            </w:r>
+          </w:p>
+        </w:tc>
+        <w:tc>
+          <w:tcPr/>
+          <w:p>
+            <w:pPr>
+              <w:pStyle w:val="Compact"/>
+            </w:pPr>
+            <w:r>
+              <w:t xml:space="preserve">Mathematical basis for decision</w:t>
+            </w:r>
+          </w:p>
+        </w:tc>
+      </w:tr>
+      <w:tr>
+        <w:tc>
+          <w:tcPr/>
+          <w:p>
+            <w:pPr>
+              <w:pStyle w:val="Compact"/>
+            </w:pPr>
+            <w:r>
+              <w:rPr>
+                <w:rStyle w:val="VerbatimChar"/>
+              </w:rPr>
+              <w:t xml:space="preserve">intervention_triggered</w:t>
+            </w:r>
+          </w:p>
+        </w:tc>
+        <w:tc>
+          <w:tcPr/>
+          <w:p>
+            <w:pPr>
+              <w:pStyle w:val="Compact"/>
+            </w:pPr>
+            <w:r>
+              <w:t xml:space="preserve">Tier, action taken, rationale</w:t>
+            </w:r>
+          </w:p>
+        </w:tc>
+        <w:tc>
+          <w:tcPr/>
+          <w:p>
+            <w:pPr>
+              <w:pStyle w:val="Compact"/>
+            </w:pPr>
+            <w:r>
+              <w:t xml:space="preserve">Records enforcement decision</w:t>
+            </w:r>
+          </w:p>
+        </w:tc>
+      </w:tr>
+      <w:tr>
+        <w:tc>
+          <w:tcPr/>
+          <w:p>
+            <w:pPr>
+              <w:pStyle w:val="Compact"/>
+            </w:pPr>
+            <w:r>
+              <w:rPr>
+                <w:rStyle w:val="VerbatimChar"/>
+              </w:rPr>
+              <w:t xml:space="preserve">turn_complete</w:t>
+            </w:r>
+          </w:p>
+        </w:tc>
+        <w:tc>
+          <w:tcPr/>
+          <w:p>
+            <w:pPr>
+              <w:pStyle w:val="Compact"/>
+            </w:pPr>
+            <w:r>
+              <w:t xml:space="preserve">Outcome, response metadata</w:t>
+            </w:r>
+          </w:p>
+        </w:tc>
+        <w:tc>
+          <w:tcPr/>
+          <w:p>
+            <w:pPr>
+              <w:pStyle w:val="Compact"/>
+            </w:pPr>
+            <w:r>
+              <w:t xml:space="preserve">Completes the audit record</w:t>
+            </w:r>
+          </w:p>
+        </w:tc>
+      </w:tr>
+      <w:tr>
+        <w:tc>
+          <w:tcPr/>
+          <w:p>
+            <w:pPr>
+              <w:pStyle w:val="Compact"/>
+            </w:pPr>
+            <w:r>
+              <w:rPr>
+                <w:rStyle w:val="VerbatimChar"/>
+              </w:rPr>
+              <w:t xml:space="preserve">session_end</w:t>
+            </w:r>
+          </w:p>
+        </w:tc>
+        <w:tc>
+          <w:tcPr/>
+          <w:p>
+            <w:pPr>
+              <w:pStyle w:val="Compact"/>
+            </w:pPr>
+            <w:r>
+              <w:t xml:space="preserve">Summary statistics, total interventions</w:t>
+            </w:r>
+          </w:p>
+        </w:tc>
+        <w:tc>
+          <w:tcPr/>
+          <w:p>
+            <w:pPr>
+              <w:pStyle w:val="Compact"/>
+            </w:pPr>
+            <w:r>
+              <w:t xml:space="preserve">Aggregates session governance</w:t>
+            </w:r>
+          </w:p>
+        </w:tc>
+      </w:tr>
+    </w:tbl>
+    <w:p>
+      <w:pPr>
+        <w:pStyle w:val="BodyText"/>
+      </w:pPr>
+      <w:r>
+        <w:rPr>
+          <w:b/>
+          <w:bCs/>
+        </w:rPr>
+        <w:t xml:space="preserve">Forensic Trace Format (JSONL)</w:t>
+      </w:r>
+      <w:r>
+        <w:t xml:space="preserve">:</w:t>
       </w:r>
     </w:p>
     <w:p>
@@ -16642,6 +16992,45 @@
         <w:rPr>
           <w:rStyle w:val="DataTypeTok"/>
         </w:rPr>
+        <w:t xml:space="preserve">"event_type"</w:t>
+      </w:r>
+      <w:r>
+        <w:rPr>
+          <w:rStyle w:val="FunctionTok"/>
+        </w:rPr>
+        <w:t xml:space="preserve">:</w:t>
+      </w:r>
+      <w:r>
+        <w:rPr>
+          <w:rStyle w:val="NormalTok"/>
+        </w:rPr>
+        <w:t xml:space="preserve"> </w:t>
+      </w:r>
+      <w:r>
+        <w:rPr>
+          <w:rStyle w:val="StringTok"/>
+        </w:rPr>
+        <w:t xml:space="preserve">"intervention_triggered"</w:t>
+      </w:r>
+      <w:r>
+        <w:rPr>
+          <w:rStyle w:val="FunctionTok"/>
+        </w:rPr>
+        <w:t xml:space="preserve">,</w:t>
+      </w:r>
+      <w:r>
+        <w:br/>
+      </w:r>
+      <w:r>
+        <w:rPr>
+          <w:rStyle w:val="NormalTok"/>
+        </w:rPr>
+        <w:t xml:space="preserve">  </w:t>
+      </w:r>
+      <w:r>
+        <w:rPr>
+          <w:rStyle w:val="DataTypeTok"/>
+        </w:rPr>
         <w:t xml:space="preserve">"timestamp"</w:t>
       </w:r>
       <w:r>
@@ -16660,7 +17049,7 @@
         <w:rPr>
           <w:rStyle w:val="StringTok"/>
         </w:rPr>
-        <w:t xml:space="preserve">"2024-11-03T10:15:30Z"</w:t>
+        <w:t xml:space="preserve">"2026-01-25T14:32:01.847Z"</w:t>
       </w:r>
       <w:r>
         <w:rPr>
@@ -16681,7 +17070,7 @@
         <w:rPr>
           <w:rStyle w:val="DataTypeTok"/>
         </w:rPr>
-        <w:t xml:space="preserve">"turn"</w:t>
+        <w:t xml:space="preserve">"session_id"</w:t>
       </w:r>
       <w:r>
         <w:rPr>
@@ -16697,9 +17086,48 @@
       </w:r>
       <w:r>
         <w:rPr>
+          <w:rStyle w:val="StringTok"/>
+        </w:rPr>
+        <w:t xml:space="preserve">"sess_a1b2c3d4"</w:t>
+      </w:r>
+      <w:r>
+        <w:rPr>
+          <w:rStyle w:val="FunctionTok"/>
+        </w:rPr>
+        <w:t xml:space="preserve">,</w:t>
+      </w:r>
+      <w:r>
+        <w:br/>
+      </w:r>
+      <w:r>
+        <w:rPr>
+          <w:rStyle w:val="NormalTok"/>
+        </w:rPr>
+        <w:t xml:space="preserve">  </w:t>
+      </w:r>
+      <w:r>
+        <w:rPr>
+          <w:rStyle w:val="DataTypeTok"/>
+        </w:rPr>
+        <w:t xml:space="preserve">"turn_number"</w:t>
+      </w:r>
+      <w:r>
+        <w:rPr>
+          <w:rStyle w:val="FunctionTok"/>
+        </w:rPr>
+        <w:t xml:space="preserve">:</w:t>
+      </w:r>
+      <w:r>
+        <w:rPr>
+          <w:rStyle w:val="NormalTok"/>
+        </w:rPr>
+        <w:t xml:space="preserve"> </w:t>
+      </w:r>
+      <w:r>
+        <w:rPr>
           <w:rStyle w:val="DecValTok"/>
         </w:rPr>
-        <w:t xml:space="preserve">15</w:t>
+        <w:t xml:space="preserve">7</w:t>
       </w:r>
       <w:r>
         <w:rPr>
@@ -16720,7 +17148,7 @@
         <w:rPr>
           <w:rStyle w:val="DataTypeTok"/>
         </w:rPr>
-        <w:t xml:space="preserve">"fidelity_scores"</w:t>
+        <w:t xml:space="preserve">"fidelity_score"</w:t>
       </w:r>
       <w:r>
         <w:rPr>
@@ -16736,9 +17164,15 @@
       </w:r>
       <w:r>
         <w:rPr>
+          <w:rStyle w:val="FloatTok"/>
+        </w:rPr>
+        <w:t xml:space="preserve">0.156</w:t>
+      </w:r>
+      <w:r>
+        <w:rPr>
           <w:rStyle w:val="FunctionTok"/>
         </w:rPr>
-        <w:t xml:space="preserve">{</w:t>
+        <w:t xml:space="preserve">,</w:t>
       </w:r>
       <w:r>
         <w:br/>
@@ -16747,13 +17181,13 @@
         <w:rPr>
           <w:rStyle w:val="NormalTok"/>
         </w:rPr>
-        <w:t xml:space="preserve">    </w:t>
+        <w:t xml:space="preserve">  </w:t>
       </w:r>
       <w:r>
         <w:rPr>
           <w:rStyle w:val="DataTypeTok"/>
         </w:rPr>
-        <w:t xml:space="preserve">"user_pa"</w:t>
+        <w:t xml:space="preserve">"raw_similarity"</w:t>
       </w:r>
       <w:r>
         <w:rPr>
@@ -16771,7 +17205,7 @@
         <w:rPr>
           <w:rStyle w:val="FloatTok"/>
         </w:rPr>
-        <w:t xml:space="preserve">0.82</w:t>
+        <w:t xml:space="preserve">0.089</w:t>
       </w:r>
       <w:r>
         <w:rPr>
@@ -16786,13 +17220,13 @@
         <w:rPr>
           <w:rStyle w:val="NormalTok"/>
         </w:rPr>
-        <w:t xml:space="preserve">    </w:t>
+        <w:t xml:space="preserve">  </w:t>
       </w:r>
       <w:r>
         <w:rPr>
           <w:rStyle w:val="DataTypeTok"/>
         </w:rPr>
-        <w:t xml:space="preserve">"ai_pa"</w:t>
+        <w:t xml:space="preserve">"tier"</w:t>
       </w:r>
       <w:r>
         <w:rPr>
@@ -16808,9 +17242,126 @@
       </w:r>
       <w:r>
         <w:rPr>
+          <w:rStyle w:val="DecValTok"/>
+        </w:rPr>
+        <w:t xml:space="preserve">1</w:t>
+      </w:r>
+      <w:r>
+        <w:rPr>
+          <w:rStyle w:val="FunctionTok"/>
+        </w:rPr>
+        <w:t xml:space="preserve">,</w:t>
+      </w:r>
+      <w:r>
+        <w:br/>
+      </w:r>
+      <w:r>
+        <w:rPr>
+          <w:rStyle w:val="NormalTok"/>
+        </w:rPr>
+        <w:t xml:space="preserve">  </w:t>
+      </w:r>
+      <w:r>
+        <w:rPr>
+          <w:rStyle w:val="DataTypeTok"/>
+        </w:rPr>
+        <w:t xml:space="preserve">"action"</w:t>
+      </w:r>
+      <w:r>
+        <w:rPr>
+          <w:rStyle w:val="FunctionTok"/>
+        </w:rPr>
+        <w:t xml:space="preserve">:</w:t>
+      </w:r>
+      <w:r>
+        <w:rPr>
+          <w:rStyle w:val="NormalTok"/>
+        </w:rPr>
+        <w:t xml:space="preserve"> </w:t>
+      </w:r>
+      <w:r>
+        <w:rPr>
+          <w:rStyle w:val="StringTok"/>
+        </w:rPr>
+        <w:t xml:space="preserve">"BLOCK"</w:t>
+      </w:r>
+      <w:r>
+        <w:rPr>
+          <w:rStyle w:val="FunctionTok"/>
+        </w:rPr>
+        <w:t xml:space="preserve">,</w:t>
+      </w:r>
+      <w:r>
+        <w:br/>
+      </w:r>
+      <w:r>
+        <w:rPr>
+          <w:rStyle w:val="NormalTok"/>
+        </w:rPr>
+        <w:t xml:space="preserve">  </w:t>
+      </w:r>
+      <w:r>
+        <w:rPr>
+          <w:rStyle w:val="DataTypeTok"/>
+        </w:rPr>
+        <w:t xml:space="preserve">"pa_config"</w:t>
+      </w:r>
+      <w:r>
+        <w:rPr>
+          <w:rStyle w:val="FunctionTok"/>
+        </w:rPr>
+        <w:t xml:space="preserve">:</w:t>
+      </w:r>
+      <w:r>
+        <w:rPr>
+          <w:rStyle w:val="NormalTok"/>
+        </w:rPr>
+        <w:t xml:space="preserve"> </w:t>
+      </w:r>
+      <w:r>
+        <w:rPr>
+          <w:rStyle w:val="StringTok"/>
+        </w:rPr>
+        <w:t xml:space="preserve">"healthcare_hipaa"</w:t>
+      </w:r>
+      <w:r>
+        <w:rPr>
+          <w:rStyle w:val="FunctionTok"/>
+        </w:rPr>
+        <w:t xml:space="preserve">,</w:t>
+      </w:r>
+      <w:r>
+        <w:br/>
+      </w:r>
+      <w:r>
+        <w:rPr>
+          <w:rStyle w:val="NormalTok"/>
+        </w:rPr>
+        <w:t xml:space="preserve">  </w:t>
+      </w:r>
+      <w:r>
+        <w:rPr>
+          <w:rStyle w:val="DataTypeTok"/>
+        </w:rPr>
+        <w:t xml:space="preserve">"threshold_applied"</w:t>
+      </w:r>
+      <w:r>
+        <w:rPr>
+          <w:rStyle w:val="FunctionTok"/>
+        </w:rPr>
+        <w:t xml:space="preserve">:</w:t>
+      </w:r>
+      <w:r>
+        <w:rPr>
+          <w:rStyle w:val="NormalTok"/>
+        </w:rPr>
+        <w:t xml:space="preserve"> </w:t>
+      </w:r>
+      <w:r>
+        <w:rPr>
           <w:rStyle w:val="FloatTok"/>
         </w:rPr>
-        <w:t xml:space="preserve">0.91</w:t>
+        <w:t xml:space="preserve">0.18</w:t>
       </w:r>
       <w:r>
         <w:rPr>
@@ -16825,13 +17376,13 @@
         <w:rPr>
           <w:rStyle w:val="NormalTok"/>
         </w:rPr>
-        <w:t xml:space="preserve">    </w:t>
+        <w:t xml:space="preserve">  </w:t>
       </w:r>
       <w:r>
         <w:rPr>
           <w:rStyle w:val="DataTypeTok"/>
         </w:rPr>
-        <w:t xml:space="preserve">"pa_correlation"</w:t>
+        <w:t xml:space="preserve">"rationale"</w:t>
       </w:r>
       <w:r>
         <w:rPr>
@@ -16847,269 +17398,17 @@
       </w:r>
       <w:r>
         <w:rPr>
-          <w:rStyle w:val="FloatTok"/>
-        </w:rPr>
-        <w:t xml:space="preserve">0.95</w:t>
+          <w:rStyle w:val="StringTok"/>
+        </w:rPr>
+        <w:t xml:space="preserve">"Fidelity below Tier 1 threshold"</w:t>
+      </w:r>
+      <w:r>
+        <w:br/>
       </w:r>
       <w:r>
         <w:rPr>
           <w:rStyle w:val="FunctionTok"/>
         </w:rPr>
-        <w:t xml:space="preserve">,</w:t>
-      </w:r>
-      <w:r>
-        <w:br/>
-      </w:r>
-      <w:r>
-        <w:rPr>
-          <w:rStyle w:val="NormalTok"/>
-        </w:rPr>
-        <w:t xml:space="preserve">    </w:t>
-      </w:r>
-      <w:r>
-        <w:rPr>
-          <w:rStyle w:val="DataTypeTok"/>
-        </w:rPr>
-        <w:t xml:space="preserve">"system"</w:t>
-      </w:r>
-      <w:r>
-        <w:rPr>
-          <w:rStyle w:val="FunctionTok"/>
-        </w:rPr>
-        <w:t xml:space="preserve">:</w:t>
-      </w:r>
-      <w:r>
-        <w:rPr>
-          <w:rStyle w:val="NormalTok"/>
-        </w:rPr>
-        <w:t xml:space="preserve"> </w:t>
-      </w:r>
-      <w:r>
-        <w:rPr>
-          <w:rStyle w:val="FloatTok"/>
-        </w:rPr>
-        <w:t xml:space="preserve">0.85</w:t>
-      </w:r>
-      <w:r>
-        <w:br/>
-      </w:r>
-      <w:r>
-        <w:rPr>
-          <w:rStyle w:val="NormalTok"/>
-        </w:rPr>
-        <w:t xml:space="preserve">  </w:t>
-      </w:r>
-      <w:r>
-        <w:rPr>
-          <w:rStyle w:val="FunctionTok"/>
-        </w:rPr>
-        <w:t xml:space="preserve">},</w:t>
-      </w:r>
-      <w:r>
-        <w:br/>
-      </w:r>
-      <w:r>
-        <w:rPr>
-          <w:rStyle w:val="NormalTok"/>
-        </w:rPr>
-        <w:t xml:space="preserve">  </w:t>
-      </w:r>
-      <w:r>
-        <w:rPr>
-          <w:rStyle w:val="DataTypeTok"/>
-        </w:rPr>
-        <w:t xml:space="preserve">"drift_vector"</w:t>
-      </w:r>
-      <w:r>
-        <w:rPr>
-          <w:rStyle w:val="FunctionTok"/>
-        </w:rPr>
-        <w:t xml:space="preserve">:</w:t>
-      </w:r>
-      <w:r>
-        <w:rPr>
-          <w:rStyle w:val="NormalTok"/>
-        </w:rPr>
-        <w:t xml:space="preserve"> </w:t>
-      </w:r>
-      <w:r>
-        <w:rPr>
-          <w:rStyle w:val="OtherTok"/>
-        </w:rPr>
-        <w:t xml:space="preserve">[</w:t>
-      </w:r>
-      <w:r>
-        <w:rPr>
-          <w:rStyle w:val="FloatTok"/>
-        </w:rPr>
-        <w:t xml:space="preserve">0.12</w:t>
-      </w:r>
-      <w:r>
-        <w:rPr>
-          <w:rStyle w:val="OtherTok"/>
-        </w:rPr>
-        <w:t xml:space="preserve">,</w:t>
-      </w:r>
-      <w:r>
-        <w:rPr>
-          <w:rStyle w:val="NormalTok"/>
-        </w:rPr>
-        <w:t xml:space="preserve"> </w:t>
-      </w:r>
-      <w:r>
-        <w:rPr>
-          <w:rStyle w:val="FloatTok"/>
-        </w:rPr>
-        <w:t xml:space="preserve">-0.08</w:t>
-      </w:r>
-      <w:r>
-        <w:rPr>
-          <w:rStyle w:val="OtherTok"/>
-        </w:rPr>
-        <w:t xml:space="preserve">,</w:t>
-      </w:r>
-      <w:r>
-        <w:rPr>
-          <w:rStyle w:val="NormalTok"/>
-        </w:rPr>
-        <w:t xml:space="preserve"> </w:t>
-      </w:r>
-      <w:r>
-        <w:rPr>
-          <w:rStyle w:val="FloatTok"/>
-        </w:rPr>
-        <w:t xml:space="preserve">0.03</w:t>
-      </w:r>
-      <w:r>
-        <w:rPr>
-          <w:rStyle w:val="OtherTok"/>
-        </w:rPr>
-        <w:t xml:space="preserve">]</w:t>
-      </w:r>
-      <w:r>
-        <w:rPr>
-          <w:rStyle w:val="FunctionTok"/>
-        </w:rPr>
-        <w:t xml:space="preserve">,</w:t>
-      </w:r>
-      <w:r>
-        <w:br/>
-      </w:r>
-      <w:r>
-        <w:rPr>
-          <w:rStyle w:val="NormalTok"/>
-        </w:rPr>
-        <w:t xml:space="preserve">  </w:t>
-      </w:r>
-      <w:r>
-        <w:rPr>
-          <w:rStyle w:val="DataTypeTok"/>
-        </w:rPr>
-        <w:t xml:space="preserve">"intervention"</w:t>
-      </w:r>
-      <w:r>
-        <w:rPr>
-          <w:rStyle w:val="FunctionTok"/>
-        </w:rPr>
-        <w:t xml:space="preserve">:</w:t>
-      </w:r>
-      <w:r>
-        <w:rPr>
-          <w:rStyle w:val="NormalTok"/>
-        </w:rPr>
-        <w:t xml:space="preserve"> </w:t>
-      </w:r>
-      <w:r>
-        <w:rPr>
-          <w:rStyle w:val="StringTok"/>
-        </w:rPr>
-        <w:t xml:space="preserve">"none"</w:t>
-      </w:r>
-      <w:r>
-        <w:rPr>
-          <w:rStyle w:val="FunctionTok"/>
-        </w:rPr>
-        <w:t xml:space="preserve">,</w:t>
-      </w:r>
-      <w:r>
-        <w:br/>
-      </w:r>
-      <w:r>
-        <w:rPr>
-          <w:rStyle w:val="NormalTok"/>
-        </w:rPr>
-        <w:t xml:space="preserve">  </w:t>
-      </w:r>
-      <w:r>
-        <w:rPr>
-          <w:rStyle w:val="DataTypeTok"/>
-        </w:rPr>
-        <w:t xml:space="preserve">"capability_index"</w:t>
-      </w:r>
-      <w:r>
-        <w:rPr>
-          <w:rStyle w:val="FunctionTok"/>
-        </w:rPr>
-        <w:t xml:space="preserve">:</w:t>
-      </w:r>
-      <w:r>
-        <w:rPr>
-          <w:rStyle w:val="NormalTok"/>
-        </w:rPr>
-        <w:t xml:space="preserve"> </w:t>
-      </w:r>
-      <w:r>
-        <w:rPr>
-          <w:rStyle w:val="FloatTok"/>
-        </w:rPr>
-        <w:t xml:space="preserve">1.24</w:t>
-      </w:r>
-      <w:r>
-        <w:rPr>
-          <w:rStyle w:val="FunctionTok"/>
-        </w:rPr>
-        <w:t xml:space="preserve">,</w:t>
-      </w:r>
-      <w:r>
-        <w:br/>
-      </w:r>
-      <w:r>
-        <w:rPr>
-          <w:rStyle w:val="NormalTok"/>
-        </w:rPr>
-        <w:t xml:space="preserve">  </w:t>
-      </w:r>
-      <w:r>
-        <w:rPr>
-          <w:rStyle w:val="DataTypeTok"/>
-        </w:rPr>
-        <w:t xml:space="preserve">"stability_status"</w:t>
-      </w:r>
-      <w:r>
-        <w:rPr>
-          <w:rStyle w:val="FunctionTok"/>
-        </w:rPr>
-        <w:t xml:space="preserve">:</w:t>
-      </w:r>
-      <w:r>
-        <w:rPr>
-          <w:rStyle w:val="NormalTok"/>
-        </w:rPr>
-        <w:t xml:space="preserve"> </w:t>
-      </w:r>
-      <w:r>
-        <w:rPr>
-          <w:rStyle w:val="StringTok"/>
-        </w:rPr>
-        <w:t xml:space="preserve">"in_control"</w:t>
-      </w:r>
-      <w:r>
-        <w:br/>
-      </w:r>
-      <w:r>
-        <w:rPr>
-          <w:rStyle w:val="FunctionTok"/>
-        </w:rPr>
         <w:t xml:space="preserve">}</w:t>
       </w:r>
     </w:p>
@@ -17118,7 +17417,365 @@
         <w:pStyle w:val="FirstParagraph"/>
       </w:pPr>
       <w:r>
-        <w:t xml:space="preserve">This creates the audit trail regulators require—demonstrable evidence of continuous governance.</w:t>
+        <w:rPr>
+          <w:b/>
+          <w:bCs/>
+        </w:rPr>
+        <w:t xml:space="preserve">Published Forensic Evidence</w:t>
+      </w:r>
+      <w:r>
+        <w:t xml:space="preserve">: All validation datasets include complete forensic audit trails:</w:t>
+      </w:r>
+    </w:p>
+    <w:tbl>
+      <w:tblPr>
+        <w:tblStyle w:val="Table"/>
+        <w:tblW w:type="auto" w:w="0"/>
+        <w:tblLook w:firstRow="1" w:lastRow="0" w:firstColumn="0" w:lastColumn="0" w:noHBand="0" w:noVBand="0" w:val="0020"/>
+      </w:tblPr>
+      <w:tblGrid>
+        <w:gridCol w:w="2640"/>
+        <w:gridCol w:w="2640"/>
+        <w:gridCol w:w="2640"/>
+      </w:tblGrid>
+      <w:tr>
+        <w:trPr>
+          <w:tblHeader w:val="on"/>
+        </w:trPr>
+        <w:tc>
+          <w:tcPr/>
+          <w:p>
+            <w:pPr>
+              <w:pStyle w:val="Compact"/>
+            </w:pPr>
+            <w:r>
+              <w:t xml:space="preserve">Dataset</w:t>
+            </w:r>
+          </w:p>
+        </w:tc>
+        <w:tc>
+          <w:tcPr/>
+          <w:p>
+            <w:pPr>
+              <w:pStyle w:val="Compact"/>
+            </w:pPr>
+            <w:r>
+              <w:t xml:space="preserve">Events Recorded</w:t>
+            </w:r>
+          </w:p>
+        </w:tc>
+        <w:tc>
+          <w:tcPr/>
+          <w:p>
+            <w:pPr>
+              <w:pStyle w:val="Compact"/>
+            </w:pPr>
+            <w:r>
+              <w:t xml:space="preserve">Trace Size</w:t>
+            </w:r>
+          </w:p>
+        </w:tc>
+      </w:tr>
+      <w:tr>
+        <w:tc>
+          <w:tcPr/>
+          <w:p>
+            <w:pPr>
+              <w:pStyle w:val="Compact"/>
+            </w:pPr>
+            <w:r>
+              <w:t xml:space="preserve">AILuminate (1,200 prompts)</w:t>
+            </w:r>
+          </w:p>
+        </w:tc>
+        <w:tc>
+          <w:tcPr/>
+          <w:p>
+            <w:pPr>
+              <w:pStyle w:val="Compact"/>
+            </w:pPr>
+            <w:r>
+              <w:t xml:space="preserve">4,803 events</w:t>
+            </w:r>
+          </w:p>
+        </w:tc>
+        <w:tc>
+          <w:tcPr/>
+          <w:p>
+            <w:pPr>
+              <w:pStyle w:val="Compact"/>
+            </w:pPr>
+            <w:r>
+              <w:t xml:space="preserve">1.69 MB</w:t>
+            </w:r>
+          </w:p>
+        </w:tc>
+      </w:tr>
+      <w:tr>
+        <w:tc>
+          <w:tcPr/>
+          <w:p>
+            <w:pPr>
+              <w:pStyle w:val="Compact"/>
+            </w:pPr>
+            <w:r>
+              <w:t xml:space="preserve">HarmBench (400 prompts)</w:t>
+            </w:r>
+          </w:p>
+        </w:tc>
+        <w:tc>
+          <w:tcPr/>
+          <w:p>
+            <w:pPr>
+              <w:pStyle w:val="Compact"/>
+            </w:pPr>
+            <w:r>
+              <w:t xml:space="preserve">1,601 events</w:t>
+            </w:r>
+          </w:p>
+        </w:tc>
+        <w:tc>
+          <w:tcPr/>
+          <w:p>
+            <w:pPr>
+              <w:pStyle w:val="Compact"/>
+            </w:pPr>
+            <w:r>
+              <w:t xml:space="preserve">0.56 MB</w:t>
+            </w:r>
+          </w:p>
+        </w:tc>
+      </w:tr>
+      <w:tr>
+        <w:tc>
+          <w:tcPr/>
+          <w:p>
+            <w:pPr>
+              <w:pStyle w:val="Compact"/>
+            </w:pPr>
+            <w:r>
+              <w:t xml:space="preserve">MedSafetyBench (900 prompts)</w:t>
+            </w:r>
+          </w:p>
+        </w:tc>
+        <w:tc>
+          <w:tcPr/>
+          <w:p>
+            <w:pPr>
+              <w:pStyle w:val="Compact"/>
+            </w:pPr>
+            <w:r>
+              <w:t xml:space="preserve">3,602 events</w:t>
+            </w:r>
+          </w:p>
+        </w:tc>
+        <w:tc>
+          <w:tcPr/>
+          <w:p>
+            <w:pPr>
+              <w:pStyle w:val="Compact"/>
+            </w:pPr>
+            <w:r>
+              <w:t xml:space="preserve">1.26 MB</w:t>
+            </w:r>
+          </w:p>
+        </w:tc>
+      </w:tr>
+      <w:tr>
+        <w:tc>
+          <w:tcPr/>
+          <w:p>
+            <w:pPr>
+              <w:pStyle w:val="Compact"/>
+            </w:pPr>
+            <w:r>
+              <w:t xml:space="preserve">SB 243 (50 prompts)</w:t>
+            </w:r>
+          </w:p>
+        </w:tc>
+        <w:tc>
+          <w:tcPr/>
+          <w:p>
+            <w:pPr>
+              <w:pStyle w:val="Compact"/>
+            </w:pPr>
+            <w:r>
+              <w:t xml:space="preserve">201 events</w:t>
+            </w:r>
+          </w:p>
+        </w:tc>
+        <w:tc>
+          <w:tcPr/>
+          <w:p>
+            <w:pPr>
+              <w:pStyle w:val="Compact"/>
+            </w:pPr>
+            <w:r>
+              <w:t xml:space="preserve">0.07 MB</w:t>
+            </w:r>
+          </w:p>
+        </w:tc>
+      </w:tr>
+      <w:tr>
+        <w:tc>
+          <w:tcPr/>
+          <w:p>
+            <w:pPr>
+              <w:pStyle w:val="Compact"/>
+            </w:pPr>
+            <w:r>
+              <w:t xml:space="preserve">XSTest (250 prompts)</w:t>
+            </w:r>
+          </w:p>
+        </w:tc>
+        <w:tc>
+          <w:tcPr/>
+          <w:p>
+            <w:pPr>
+              <w:pStyle w:val="Compact"/>
+            </w:pPr>
+            <w:r>
+              <w:t xml:space="preserve">1,001 events</w:t>
+            </w:r>
+          </w:p>
+        </w:tc>
+        <w:tc>
+          <w:tcPr/>
+          <w:p>
+            <w:pPr>
+              <w:pStyle w:val="Compact"/>
+            </w:pPr>
+            <w:r>
+              <w:t xml:space="preserve">0.35 MB</w:t>
+            </w:r>
+          </w:p>
+        </w:tc>
+      </w:tr>
+    </w:tbl>
+    <w:p>
+      <w:pPr>
+        <w:pStyle w:val="BodyText"/>
+      </w:pPr>
+      <w:r>
+        <w:t xml:space="preserve">These traces enable independent verification of every governance decision across all 2,550 adversarial attacks. Researchers and regulators can examine the mathematical basis for each block without relying on aggregate statistics alone.</w:t>
+      </w:r>
+    </w:p>
+    <w:p>
+      <w:pPr>
+        <w:pStyle w:val="BodyText"/>
+      </w:pPr>
+      <w:r>
+        <w:rPr>
+          <w:b/>
+          <w:bCs/>
+        </w:rPr>
+        <w:t xml:space="preserve">Regulatory Alignment</w:t>
+      </w:r>
+      <w:r>
+        <w:t xml:space="preserve">: The forensic trace format addresses specific requirements:</w:t>
+      </w:r>
+    </w:p>
+    <w:p>
+      <w:pPr>
+        <w:pStyle w:val="Compact"/>
+        <w:numPr>
+          <w:ilvl w:val="0"/>
+          <w:numId w:val="1026"/>
+        </w:numPr>
+      </w:pPr>
+      <w:r>
+        <w:rPr>
+          <w:b/>
+          <w:bCs/>
+        </w:rPr>
+        <w:t xml:space="preserve">EU AI Act Article 12</w:t>
+      </w:r>
+      <w:r>
+        <w:t xml:space="preserve">: Automatic recording of events during operation</w:t>
+      </w:r>
+    </w:p>
+    <w:p>
+      <w:pPr>
+        <w:pStyle w:val="Compact"/>
+        <w:numPr>
+          <w:ilvl w:val="0"/>
+          <w:numId w:val="1026"/>
+        </w:numPr>
+      </w:pPr>
+      <w:r>
+        <w:rPr>
+          <w:b/>
+          <w:bCs/>
+        </w:rPr>
+        <w:t xml:space="preserve">EU AI Act Article 72</w:t>
+      </w:r>
+      <w:r>
+        <w:t xml:space="preserve">: Post-market monitoring with continuous logging</w:t>
+      </w:r>
+    </w:p>
+    <w:p>
+      <w:pPr>
+        <w:pStyle w:val="Compact"/>
+        <w:numPr>
+          <w:ilvl w:val="0"/>
+          <w:numId w:val="1026"/>
+        </w:numPr>
+      </w:pPr>
+      <w:r>
+        <w:rPr>
+          <w:b/>
+          <w:bCs/>
+        </w:rPr>
+        <w:t xml:space="preserve">California SB 53</w:t>
+      </w:r>
+      <w:r>
+        <w:t xml:space="preserve">: Documentation of safety-relevant decisions</w:t>
+      </w:r>
+    </w:p>
+    <w:p>
+      <w:pPr>
+        <w:pStyle w:val="Compact"/>
+        <w:numPr>
+          <w:ilvl w:val="0"/>
+          <w:numId w:val="1026"/>
+        </w:numPr>
+      </w:pPr>
+      <w:r>
+        <w:rPr>
+          <w:b/>
+          <w:bCs/>
+        </w:rPr>
+        <w:t xml:space="preserve">HIPAA Security Rule</w:t>
+      </w:r>
+      <w:r>
+        <w:t xml:space="preserve">: Audit controls for access and decision logging</w:t>
+      </w:r>
+    </w:p>
+    <w:p>
+      <w:pPr>
+        <w:pStyle w:val="Compact"/>
+        <w:numPr>
+          <w:ilvl w:val="0"/>
+          <w:numId w:val="1026"/>
+        </w:numPr>
+      </w:pPr>
+      <w:r>
+        <w:rPr>
+          <w:b/>
+          <w:bCs/>
+        </w:rPr>
+        <w:t xml:space="preserve">ISO 27001</w:t>
+      </w:r>
+      <w:r>
+        <w:t xml:space="preserve">: Information security event logging</w:t>
+      </w:r>
+    </w:p>
+    <w:p>
+      <w:pPr>
+        <w:pStyle w:val="FirstParagraph"/>
+      </w:pPr>
+      <w:r>
+        <w:t xml:space="preserve">The JSONL format integrates with standard log aggregation infrastructure (Elasticsearch, Splunk, CloudWatch) for enterprise compliance workflows.</w:t>
       </w:r>
     </w:p>
     <w:bookmarkEnd w:id="83"/>
@@ -18002,7 +18659,7 @@
         <w:pStyle w:val="Compact"/>
         <w:numPr>
           <w:ilvl w:val="0"/>
-          <w:numId w:val="1026"/>
+          <w:numId w:val="1027"/>
         </w:numPr>
       </w:pPr>
       <w:r>
@@ -18021,7 +18678,7 @@
         <w:pStyle w:val="Compact"/>
         <w:numPr>
           <w:ilvl w:val="0"/>
-          <w:numId w:val="1026"/>
+          <w:numId w:val="1027"/>
         </w:numPr>
       </w:pPr>
       <w:r>
@@ -18040,7 +18697,7 @@
         <w:pStyle w:val="Compact"/>
         <w:numPr>
           <w:ilvl w:val="0"/>
-          <w:numId w:val="1026"/>
+          <w:numId w:val="1027"/>
         </w:numPr>
       </w:pPr>
       <w:r>
@@ -18059,7 +18716,7 @@
         <w:pStyle w:val="Compact"/>
         <w:numPr>
           <w:ilvl w:val="0"/>
-          <w:numId w:val="1026"/>
+          <w:numId w:val="1027"/>
         </w:numPr>
       </w:pPr>
       <w:r>
@@ -19738,7 +20395,7 @@
         <w:pStyle w:val="Compact"/>
         <w:numPr>
           <w:ilvl w:val="0"/>
-          <w:numId w:val="1027"/>
+          <w:numId w:val="1028"/>
         </w:numPr>
       </w:pPr>
       <w:r>
@@ -19760,7 +20417,7 @@
         <w:pStyle w:val="Compact"/>
         <w:numPr>
           <w:ilvl w:val="0"/>
-          <w:numId w:val="1027"/>
+          <w:numId w:val="1028"/>
         </w:numPr>
       </w:pPr>
       <w:r>
@@ -19782,7 +20439,7 @@
         <w:pStyle w:val="Compact"/>
         <w:numPr>
           <w:ilvl w:val="0"/>
-          <w:numId w:val="1027"/>
+          <w:numId w:val="1028"/>
         </w:numPr>
       </w:pPr>
       <w:r>
@@ -19804,7 +20461,7 @@
         <w:pStyle w:val="Compact"/>
         <w:numPr>
           <w:ilvl w:val="0"/>
-          <w:numId w:val="1027"/>
+          <w:numId w:val="1028"/>
         </w:numPr>
       </w:pPr>
       <w:r>
@@ -22015,7 +22672,7 @@
         <w:pStyle w:val="Compact"/>
         <w:numPr>
           <w:ilvl w:val="0"/>
-          <w:numId w:val="1028"/>
+          <w:numId w:val="1029"/>
         </w:numPr>
       </w:pPr>
       <w:r>
@@ -22030,144 +22687,6 @@
       </w:r>
       <w:r>
         <w:t xml:space="preserve">constitutional requirements (purpose, scope, boundaries)</w:t>
-      </w:r>
-    </w:p>
-    <w:p>
-      <w:pPr>
-        <w:pStyle w:val="Compact"/>
-        <w:numPr>
-          <w:ilvl w:val="0"/>
-          <w:numId w:val="1028"/>
-        </w:numPr>
-      </w:pPr>
-      <w:r>
-        <w:rPr>
-          <w:b/>
-          <w:bCs/>
-        </w:rPr>
-        <w:t xml:space="preserve">Primacy Attractor instantiates</w:t>
-      </w:r>
-      <w:r>
-        <w:t xml:space="preserve"> </w:t>
-      </w:r>
-      <w:r>
-        <w:t xml:space="preserve">these as fixed reference in embedding space</w:t>
-      </w:r>
-    </w:p>
-    <w:p>
-      <w:pPr>
-        <w:pStyle w:val="Compact"/>
-        <w:numPr>
-          <w:ilvl w:val="0"/>
-          <w:numId w:val="1028"/>
-        </w:numPr>
-      </w:pPr>
-      <w:r>
-        <w:rPr>
-          <w:b/>
-          <w:bCs/>
-        </w:rPr>
-        <w:t xml:space="preserve">Orchestration-layer governance enforces</w:t>
-      </w:r>
-      <w:r>
-        <w:t xml:space="preserve"> </w:t>
-      </w:r>
-      <w:r>
-        <w:t xml:space="preserve">compliance through quantitative measurement</w:t>
-      </w:r>
-    </w:p>
-    <w:p>
-      <w:pPr>
-        <w:pStyle w:val="Compact"/>
-        <w:numPr>
-          <w:ilvl w:val="0"/>
-          <w:numId w:val="1028"/>
-        </w:numPr>
-      </w:pPr>
-      <w:r>
-        <w:rPr>
-          <w:b/>
-          <w:bCs/>
-        </w:rPr>
-        <w:t xml:space="preserve">Proportional intervention</w:t>
-      </w:r>
-      <w:r>
-        <w:t xml:space="preserve"> </w:t>
-      </w:r>
-      <w:r>
-        <w:t xml:space="preserve">applies graduated corrections (gentle → strong → regeneration)</w:t>
-      </w:r>
-    </w:p>
-    <w:p>
-      <w:pPr>
-        <w:pStyle w:val="Compact"/>
-        <w:numPr>
-          <w:ilvl w:val="0"/>
-          <w:numId w:val="1028"/>
-        </w:numPr>
-      </w:pPr>
-      <w:r>
-        <w:rPr>
-          <w:b/>
-          <w:bCs/>
-        </w:rPr>
-        <w:t xml:space="preserve">JSONL telemetry</w:t>
-      </w:r>
-      <w:r>
-        <w:t xml:space="preserve"> </w:t>
-      </w:r>
-      <w:r>
-        <w:t xml:space="preserve">generates complete audit trails for regulatory submission</w:t>
-      </w:r>
-    </w:p>
-    <w:p>
-      <w:pPr>
-        <w:pStyle w:val="FirstParagraph"/>
-      </w:pPr>
-      <w:r>
-        <w:t xml:space="preserve">This is not prompt engineering—it is</w:t>
-      </w:r>
-      <w:r>
-        <w:t xml:space="preserve"> </w:t>
-      </w:r>
-      <w:r>
-        <w:rPr>
-          <w:b/>
-          <w:bCs/>
-        </w:rPr>
-        <w:t xml:space="preserve">architectural governance</w:t>
-      </w:r>
-      <w:r>
-        <w:t xml:space="preserve"> </w:t>
-      </w:r>
-      <w:r>
-        <w:t xml:space="preserve">operating above the model layer.</w:t>
-      </w:r>
-    </w:p>
-    <w:p>
-      <w:pPr>
-        <w:pStyle w:val="BodyText"/>
-      </w:pPr>
-      <w:r>
-        <w:t xml:space="preserve">Adversarial validation (0% ASR) proves the security properties that SB 53 safety frameworks must document. JSONL telemetry provides the continuous monitoring evidence that EU AI Act Article 72 explicitly requires. The Constitutional Filter addresses immediate regulatory compliance needs with empirically validated infrastructure.</w:t>
-      </w:r>
-    </w:p>
-    <w:bookmarkEnd w:id="116"/>
-    <w:bookmarkStart w:id="117" w:name="from-aspiration-to-empirical-evidence"/>
-    <w:p>
-      <w:pPr>
-        <w:pStyle w:val="Heading3"/>
-      </w:pPr>
-      <w:r>
-        <w:t xml:space="preserve">From Aspiration to Empirical Evidence</w:t>
-      </w:r>
-    </w:p>
-    <w:p>
-      <w:pPr>
-        <w:pStyle w:val="FirstParagraph"/>
-      </w:pPr>
-      <w:r>
-        <w:t xml:space="preserve">We do not claim to have solved AI governance. We claim to have made it:</w:t>
       </w:r>
     </w:p>
     <w:p>
@@ -22183,13 +22702,13 @@
           <w:b/>
           <w:bCs/>
         </w:rPr>
-        <w:t xml:space="preserve">Measurable</w:t>
-      </w:r>
-      <w:r>
-        <w:t xml:space="preserve"> </w:t>
-      </w:r>
-      <w:r>
-        <w:t xml:space="preserve">through quantitative fidelity scores and ASR/VDR metrics</w:t>
+        <w:t xml:space="preserve">Primacy Attractor instantiates</w:t>
+      </w:r>
+      <w:r>
+        <w:t xml:space="preserve"> </w:t>
+      </w:r>
+      <w:r>
+        <w:t xml:space="preserve">these as fixed reference in embedding space</w:t>
       </w:r>
     </w:p>
     <w:p>
@@ -22205,13 +22724,13 @@
           <w:b/>
           <w:bCs/>
         </w:rPr>
-        <w:t xml:space="preserve">Defensible</w:t>
-      </w:r>
-      <w:r>
-        <w:t xml:space="preserve"> </w:t>
-      </w:r>
-      <w:r>
-        <w:t xml:space="preserve">through 0% ASR adversarial validation</w:t>
+        <w:t xml:space="preserve">Orchestration-layer governance enforces</w:t>
+      </w:r>
+      <w:r>
+        <w:t xml:space="preserve"> </w:t>
+      </w:r>
+      <w:r>
+        <w:t xml:space="preserve">compliance through quantitative measurement</w:t>
       </w:r>
     </w:p>
     <w:p>
@@ -22227,13 +22746,13 @@
           <w:b/>
           <w:bCs/>
         </w:rPr>
-        <w:t xml:space="preserve">Auditable</w:t>
-      </w:r>
-      <w:r>
-        <w:t xml:space="preserve"> </w:t>
-      </w:r>
-      <w:r>
-        <w:t xml:space="preserve">through comprehensive JSONL telemetry</w:t>
+        <w:t xml:space="preserve">Proportional intervention</w:t>
+      </w:r>
+      <w:r>
+        <w:t xml:space="preserve"> </w:t>
+      </w:r>
+      <w:r>
+        <w:t xml:space="preserve">applies graduated corrections (gentle → strong → regeneration)</w:t>
       </w:r>
     </w:p>
     <w:p>
@@ -22242,6 +22761,144 @@
         <w:numPr>
           <w:ilvl w:val="0"/>
           <w:numId w:val="1029"/>
+        </w:numPr>
+      </w:pPr>
+      <w:r>
+        <w:rPr>
+          <w:b/>
+          <w:bCs/>
+        </w:rPr>
+        <w:t xml:space="preserve">JSONL telemetry</w:t>
+      </w:r>
+      <w:r>
+        <w:t xml:space="preserve"> </w:t>
+      </w:r>
+      <w:r>
+        <w:t xml:space="preserve">generates complete audit trails for regulatory submission</w:t>
+      </w:r>
+    </w:p>
+    <w:p>
+      <w:pPr>
+        <w:pStyle w:val="FirstParagraph"/>
+      </w:pPr>
+      <w:r>
+        <w:t xml:space="preserve">This is not prompt engineering—it is</w:t>
+      </w:r>
+      <w:r>
+        <w:t xml:space="preserve"> </w:t>
+      </w:r>
+      <w:r>
+        <w:rPr>
+          <w:b/>
+          <w:bCs/>
+        </w:rPr>
+        <w:t xml:space="preserve">architectural governance</w:t>
+      </w:r>
+      <w:r>
+        <w:t xml:space="preserve"> </w:t>
+      </w:r>
+      <w:r>
+        <w:t xml:space="preserve">operating above the model layer.</w:t>
+      </w:r>
+    </w:p>
+    <w:p>
+      <w:pPr>
+        <w:pStyle w:val="BodyText"/>
+      </w:pPr>
+      <w:r>
+        <w:t xml:space="preserve">Adversarial validation (0% ASR) proves the security properties that SB 53 safety frameworks must document. JSONL telemetry provides the continuous monitoring evidence that EU AI Act Article 72 explicitly requires. The Constitutional Filter addresses immediate regulatory compliance needs with empirically validated infrastructure.</w:t>
+      </w:r>
+    </w:p>
+    <w:bookmarkEnd w:id="116"/>
+    <w:bookmarkStart w:id="117" w:name="from-aspiration-to-empirical-evidence"/>
+    <w:p>
+      <w:pPr>
+        <w:pStyle w:val="Heading3"/>
+      </w:pPr>
+      <w:r>
+        <w:t xml:space="preserve">From Aspiration to Empirical Evidence</w:t>
+      </w:r>
+    </w:p>
+    <w:p>
+      <w:pPr>
+        <w:pStyle w:val="FirstParagraph"/>
+      </w:pPr>
+      <w:r>
+        <w:t xml:space="preserve">We do not claim to have solved AI governance. We claim to have made it:</w:t>
+      </w:r>
+    </w:p>
+    <w:p>
+      <w:pPr>
+        <w:pStyle w:val="Compact"/>
+        <w:numPr>
+          <w:ilvl w:val="0"/>
+          <w:numId w:val="1030"/>
+        </w:numPr>
+      </w:pPr>
+      <w:r>
+        <w:rPr>
+          <w:b/>
+          <w:bCs/>
+        </w:rPr>
+        <w:t xml:space="preserve">Measurable</w:t>
+      </w:r>
+      <w:r>
+        <w:t xml:space="preserve"> </w:t>
+      </w:r>
+      <w:r>
+        <w:t xml:space="preserve">through quantitative fidelity scores and ASR/VDR metrics</w:t>
+      </w:r>
+    </w:p>
+    <w:p>
+      <w:pPr>
+        <w:pStyle w:val="Compact"/>
+        <w:numPr>
+          <w:ilvl w:val="0"/>
+          <w:numId w:val="1030"/>
+        </w:numPr>
+      </w:pPr>
+      <w:r>
+        <w:rPr>
+          <w:b/>
+          <w:bCs/>
+        </w:rPr>
+        <w:t xml:space="preserve">Defensible</w:t>
+      </w:r>
+      <w:r>
+        <w:t xml:space="preserve"> </w:t>
+      </w:r>
+      <w:r>
+        <w:t xml:space="preserve">through 0% ASR adversarial validation</w:t>
+      </w:r>
+    </w:p>
+    <w:p>
+      <w:pPr>
+        <w:pStyle w:val="Compact"/>
+        <w:numPr>
+          <w:ilvl w:val="0"/>
+          <w:numId w:val="1030"/>
+        </w:numPr>
+      </w:pPr>
+      <w:r>
+        <w:rPr>
+          <w:b/>
+          <w:bCs/>
+        </w:rPr>
+        <w:t xml:space="preserve">Auditable</w:t>
+      </w:r>
+      <w:r>
+        <w:t xml:space="preserve"> </w:t>
+      </w:r>
+      <w:r>
+        <w:t xml:space="preserve">through comprehensive JSONL telemetry</w:t>
+      </w:r>
+    </w:p>
+    <w:p>
+      <w:pPr>
+        <w:pStyle w:val="Compact"/>
+        <w:numPr>
+          <w:ilvl w:val="0"/>
+          <w:numId w:val="1030"/>
         </w:numPr>
       </w:pPr>
       <w:r>
@@ -22965,7 +23622,7 @@
     </w:p>
     <w:bookmarkEnd w:id="123"/>
     <w:bookmarkEnd w:id="124"/>
-    <w:bookmarkStart w:id="132" w:name="X903819a0938eb1bcf4a44a7cfb856608a6d01d8"/>
+    <w:bookmarkStart w:id="137" w:name="X903819a0938eb1bcf4a44a7cfb856608a6d01d8"/>
     <w:p>
       <w:pPr>
         <w:pStyle w:val="Heading2"/>
@@ -23446,7 +24103,7 @@
       </w:r>
     </w:p>
     <w:bookmarkEnd w:id="128"/>
-    <w:bookmarkStart w:id="129" w:name="data-availability"/>
+    <w:bookmarkStart w:id="134" w:name="data-availability"/>
     <w:p>
       <w:pPr>
         <w:pStyle w:val="Heading3"/>
@@ -23464,13 +24121,25 @@
           <w:b/>
           <w:bCs/>
         </w:rPr>
-        <w:t xml:space="preserve">Published Validation Results</w:t>
-      </w:r>
-      <w:r>
-        <w:t xml:space="preserve"> </w:t>
-      </w:r>
-      <w:r>
-        <w:t xml:space="preserve">(included in repository):</w:t>
+        <w:t xml:space="preserve">Zenodo Validation Datasets</w:t>
+      </w:r>
+      <w:r>
+        <w:t xml:space="preserve"> </w:t>
+      </w:r>
+      <w:r>
+        <w:t xml:space="preserve">(with forensic audit trails):</w:t>
+      </w:r>
+    </w:p>
+    <w:p>
+      <w:pPr>
+        <w:pStyle w:val="BodyText"/>
+      </w:pPr>
+      <w:r>
+        <w:rPr>
+          <w:i/>
+          <w:iCs/>
+        </w:rPr>
+        <w:t xml:space="preserve">Safety Benchmarks (Adversarial Attack Testing):</w:t>
       </w:r>
       <w:r>
         <w:t xml:space="preserve"> </w:t>
@@ -23483,6 +24152,244 @@
       </w:r>
       <w:r>
         <w:rPr>
+          <w:b/>
+          <w:bCs/>
+        </w:rPr>
+        <w:t xml:space="preserve">AILuminate (MLCommons)</w:t>
+      </w:r>
+      <w:r>
+        <w:t xml:space="preserve">: DOI</w:t>
+      </w:r>
+      <w:r>
+        <w:t xml:space="preserve"> </w:t>
+      </w:r>
+      <w:hyperlink r:id="rId129">
+        <w:r>
+          <w:rPr>
+            <w:rStyle w:val="Hyperlink"/>
+          </w:rPr>
+          <w:t xml:space="preserve">10.5281/zenodo.18370263</w:t>
+        </w:r>
+      </w:hyperlink>
+      <w:r>
+        <w:t xml:space="preserve"> </w:t>
+      </w:r>
+      <w:r>
+        <w:t xml:space="preserve">- 1,200 prompts, 0% ASR</w:t>
+      </w:r>
+      <w:r>
+        <w:t xml:space="preserve"> </w:t>
+      </w:r>
+      <w:r>
+        <w:t xml:space="preserve">-</w:t>
+      </w:r>
+      <w:r>
+        <w:t xml:space="preserve"> </w:t>
+      </w:r>
+      <w:r>
+        <w:rPr>
+          <w:b/>
+          <w:bCs/>
+        </w:rPr>
+        <w:t xml:space="preserve">Adversarial Validation (HarmBench + MedSafetyBench)</w:t>
+      </w:r>
+      <w:r>
+        <w:t xml:space="preserve">: DOI</w:t>
+      </w:r>
+      <w:r>
+        <w:t xml:space="preserve"> </w:t>
+      </w:r>
+      <w:hyperlink r:id="rId130">
+        <w:r>
+          <w:rPr>
+            <w:rStyle w:val="Hyperlink"/>
+          </w:rPr>
+          <w:t xml:space="preserve">10.5281/zenodo.18013104</w:t>
+        </w:r>
+      </w:hyperlink>
+      <w:r>
+        <w:t xml:space="preserve"> </w:t>
+      </w:r>
+      <w:r>
+        <w:t xml:space="preserve">- 1,300 attacks, 0% ASR</w:t>
+      </w:r>
+      <w:r>
+        <w:t xml:space="preserve"> </w:t>
+      </w:r>
+      <w:r>
+        <w:t xml:space="preserve">-</w:t>
+      </w:r>
+      <w:r>
+        <w:t xml:space="preserve"> </w:t>
+      </w:r>
+      <w:r>
+        <w:rPr>
+          <w:b/>
+          <w:bCs/>
+        </w:rPr>
+        <w:t xml:space="preserve">SB 243 Child Safety</w:t>
+      </w:r>
+      <w:r>
+        <w:t xml:space="preserve">: DOI</w:t>
+      </w:r>
+      <w:r>
+        <w:t xml:space="preserve"> </w:t>
+      </w:r>
+      <w:hyperlink r:id="rId131">
+        <w:r>
+          <w:rPr>
+            <w:rStyle w:val="Hyperlink"/>
+          </w:rPr>
+          <w:t xml:space="preserve">10.5281/zenodo.18027446</w:t>
+        </w:r>
+      </w:hyperlink>
+      <w:r>
+        <w:t xml:space="preserve"> </w:t>
+      </w:r>
+      <w:r>
+        <w:t xml:space="preserve">- 50 attacks, 0% ASR</w:t>
+      </w:r>
+      <w:r>
+        <w:t xml:space="preserve"> </w:t>
+      </w:r>
+      <w:r>
+        <w:t xml:space="preserve">-</w:t>
+      </w:r>
+      <w:r>
+        <w:t xml:space="preserve"> </w:t>
+      </w:r>
+      <w:r>
+        <w:rPr>
+          <w:b/>
+          <w:bCs/>
+        </w:rPr>
+        <w:t xml:space="preserve">XSTest Calibration</w:t>
+      </w:r>
+      <w:r>
+        <w:t xml:space="preserve">: DOI</w:t>
+      </w:r>
+      <w:r>
+        <w:t xml:space="preserve"> </w:t>
+      </w:r>
+      <w:hyperlink r:id="rId132">
+        <w:r>
+          <w:rPr>
+            <w:rStyle w:val="Hyperlink"/>
+          </w:rPr>
+          <w:t xml:space="preserve">10.5281/zenodo.18370603</w:t>
+        </w:r>
+      </w:hyperlink>
+      <w:r>
+        <w:t xml:space="preserve"> </w:t>
+      </w:r>
+      <w:r>
+        <w:t xml:space="preserve">- Threshold calibration</w:t>
+      </w:r>
+    </w:p>
+    <w:p>
+      <w:pPr>
+        <w:pStyle w:val="BodyText"/>
+      </w:pPr>
+      <w:r>
+        <w:rPr>
+          <w:i/>
+          <w:iCs/>
+        </w:rPr>
+        <w:t xml:space="preserve">Academic Benchmarks (OOS Detection Proof-of-Concept):</w:t>
+      </w:r>
+      <w:r>
+        <w:t xml:space="preserve"> </w:t>
+      </w:r>
+      <w:r>
+        <w:t xml:space="preserve">-</w:t>
+      </w:r>
+      <w:r>
+        <w:t xml:space="preserve"> </w:t>
+      </w:r>
+      <w:r>
+        <w:rPr>
+          <w:b/>
+          <w:bCs/>
+        </w:rPr>
+        <w:t xml:space="preserve">Governance Benchmark (CLINC150/MultiWOZ)</w:t>
+      </w:r>
+      <w:r>
+        <w:t xml:space="preserve">: DOI</w:t>
+      </w:r>
+      <w:r>
+        <w:t xml:space="preserve"> </w:t>
+      </w:r>
+      <w:hyperlink r:id="rId133">
+        <w:r>
+          <w:rPr>
+            <w:rStyle w:val="Hyperlink"/>
+          </w:rPr>
+          <w:t xml:space="preserve">10.5281/zenodo.18009153</w:t>
+        </w:r>
+      </w:hyperlink>
+      <w:r>
+        <w:t xml:space="preserve"> </w:t>
+      </w:r>
+      <w:r>
+        <w:t xml:space="preserve">- OOS: 78% detection, Drift: 100% detection</w:t>
+      </w:r>
+    </w:p>
+    <w:p>
+      <w:pPr>
+        <w:pStyle w:val="BodyText"/>
+      </w:pPr>
+      <w:r>
+        <w:rPr>
+          <w:b/>
+          <w:bCs/>
+        </w:rPr>
+        <w:t xml:space="preserve">Total Safety Validated</w:t>
+      </w:r>
+      <w:r>
+        <w:t xml:space="preserve">: 2,800+ adversarial prompts |</w:t>
+      </w:r>
+      <w:r>
+        <w:t xml:space="preserve"> </w:t>
+      </w:r>
+      <w:r>
+        <w:rPr>
+          <w:b/>
+          <w:bCs/>
+        </w:rPr>
+        <w:t xml:space="preserve">Combined ASR</w:t>
+      </w:r>
+      <w:r>
+        <w:t xml:space="preserve">: 0.00%</w:t>
+      </w:r>
+    </w:p>
+    <w:p>
+      <w:pPr>
+        <w:pStyle w:val="BodyText"/>
+      </w:pPr>
+      <w:r>
+        <w:rPr>
+          <w:b/>
+          <w:bCs/>
+        </w:rPr>
+        <w:t xml:space="preserve">Repository Files</w:t>
+      </w:r>
+      <w:r>
+        <w:t xml:space="preserve"> </w:t>
+      </w:r>
+      <w:r>
+        <w:t xml:space="preserve">(included locally):</w:t>
+      </w:r>
+      <w:r>
+        <w:t xml:space="preserve"> </w:t>
+      </w:r>
+      <w:r>
+        <w:t xml:space="preserve">-</w:t>
+      </w:r>
+      <w:r>
+        <w:t xml:space="preserve"> </w:t>
+      </w:r>
+      <w:r>
+        <w:rPr>
           <w:rStyle w:val="VerbatimChar"/>
         </w:rPr>
         <w:t xml:space="preserve">validation/telos_complete_validation_dataset.json</w:t>
@@ -23512,7 +24419,7 @@
         <w:t xml:space="preserve"> </w:t>
       </w:r>
       <w:r>
-        <w:t xml:space="preserve">- 900 healthcare attacks (NeurIPS 2024)</w:t>
+        <w:t xml:space="preserve">- 900 healthcare attacks</w:t>
       </w:r>
       <w:r>
         <w:t xml:space="preserve"> </w:t>
@@ -23554,7 +24461,7 @@
         <w:t xml:space="preserve"> </w:t>
       </w:r>
       <w:r>
-        <w:t xml:space="preserve">- Internal validation:</w:t>
+        <w:t xml:space="preserve">- Forensic validation:</w:t>
       </w:r>
       <w:r>
         <w:t xml:space="preserve"> </w:t>
@@ -23563,13 +24470,19 @@
         <w:rPr>
           <w:rStyle w:val="VerbatimChar"/>
         </w:rPr>
-        <w:t xml:space="preserve">telos_observatory_v3/telos_purpose/validation/run_internal_test0.py</w:t>
-      </w:r>
-      <w:r>
-        <w:t xml:space="preserve"> </w:t>
-      </w:r>
-      <w:r>
-        <w:t xml:space="preserve">- See</w:t>
+        <w:t xml:space="preserve">validation/run_forensic_validation.py</w:t>
+      </w:r>
+      <w:r>
+        <w:t xml:space="preserve"> </w:t>
+      </w:r>
+      <w:r>
+        <w:t xml:space="preserve">(produces full audit trails)</w:t>
+      </w:r>
+      <w:r>
+        <w:t xml:space="preserve"> </w:t>
+      </w:r>
+      <w:r>
+        <w:t xml:space="preserve">- Protocol documentation:</w:t>
       </w:r>
       <w:r>
         <w:t xml:space="preserve"> </w:t>
@@ -23578,13 +24491,7 @@
         <w:rPr>
           <w:rStyle w:val="VerbatimChar"/>
         </w:rPr>
-        <w:t xml:space="preserve">docs/REPRODUCTION_GUIDE.md</w:t>
-      </w:r>
-      <w:r>
-        <w:t xml:space="preserve"> </w:t>
-      </w:r>
-      <w:r>
-        <w:t xml:space="preserve">for step-by-step instructions</w:t>
+        <w:t xml:space="preserve">validation/VALIDATION_PROTOCOL.md</w:t>
       </w:r>
       <w:r>
         <w:t xml:space="preserve"> </w:t>
@@ -23593,8 +24500,8 @@
         <w:t xml:space="preserve">- TELOS configuration: Dual PA architecture with Layer 2 fidelity measurement</w:t>
       </w:r>
     </w:p>
-    <w:bookmarkEnd w:id="129"/>
-    <w:bookmarkStart w:id="130" w:name="what-this-validates"/>
+    <w:bookmarkEnd w:id="134"/>
+    <w:bookmarkStart w:id="135" w:name="what-this-validates"/>
     <w:p>
       <w:pPr>
         <w:pStyle w:val="Heading3"/>
@@ -23681,8 +24588,8 @@
         <w:t xml:space="preserve">- Expanded attack library (100+ attacks across additional categories)</w:t>
       </w:r>
     </w:p>
-    <w:bookmarkEnd w:id="130"/>
-    <w:bookmarkStart w:id="131" w:name="next-steps"/>
+    <w:bookmarkEnd w:id="135"/>
+    <w:bookmarkStart w:id="136" w:name="next-steps"/>
     <w:p>
       <w:pPr>
         <w:pStyle w:val="Heading3"/>
@@ -23770,9 +24677,9 @@
         </w:pict>
       </w:r>
     </w:p>
-    <w:bookmarkEnd w:id="131"/>
-    <w:bookmarkEnd w:id="132"/>
-    <w:bookmarkStart w:id="135" w:name="X642a2a8a48569b0c6d9638719b0197044f6fe21"/>
+    <w:bookmarkEnd w:id="136"/>
+    <w:bookmarkEnd w:id="137"/>
+    <w:bookmarkStart w:id="140" w:name="X642a2a8a48569b0c6d9638719b0197044f6fe21"/>
     <w:p>
       <w:pPr>
         <w:pStyle w:val="Heading2"/>
@@ -23789,7 +24696,7 @@
         <w:t xml:space="preserve">The system creates a complete audit trail of every conversation. Here’s a simplified view of what gets recorded:</w:t>
       </w:r>
     </w:p>
-    <w:bookmarkStart w:id="133" w:name="what-we-track-every-turn"/>
+    <w:bookmarkStart w:id="138" w:name="what-we-track-every-turn"/>
     <w:p>
       <w:pPr>
         <w:pStyle w:val="Heading3"/>
@@ -23908,8 +24815,8 @@
         <w:t xml:space="preserve">Status: Within acceptable range, no correction needed</w:t>
       </w:r>
     </w:p>
-    <w:bookmarkEnd w:id="133"/>
-    <w:bookmarkStart w:id="134" w:name="when-intervention-happens"/>
+    <w:bookmarkEnd w:id="138"/>
+    <w:bookmarkStart w:id="139" w:name="when-intervention-happens"/>
     <w:p>
       <w:pPr>
         <w:pStyle w:val="Heading3"/>
@@ -23983,9 +24890,9 @@
         </w:pict>
       </w:r>
     </w:p>
-    <w:bookmarkEnd w:id="134"/>
-    <w:bookmarkEnd w:id="135"/>
-    <w:bookmarkStart w:id="136" w:name="appendix-f-key-terms"/>
+    <w:bookmarkEnd w:id="139"/>
+    <w:bookmarkEnd w:id="140"/>
+    <w:bookmarkStart w:id="141" w:name="appendix-f-key-terms"/>
     <w:p>
       <w:pPr>
         <w:pStyle w:val="Heading2"/>
@@ -24121,8 +25028,8 @@
         </w:pict>
       </w:r>
     </w:p>
-    <w:bookmarkEnd w:id="136"/>
-    <w:bookmarkStart w:id="137" w:name="appendix-g-foundational-document-stack"/>
+    <w:bookmarkEnd w:id="141"/>
+    <w:bookmarkStart w:id="142" w:name="appendix-g-foundational-document-stack"/>
     <w:p>
       <w:pPr>
         <w:pStyle w:val="Heading2"/>
@@ -24540,8 +25447,8 @@
         <w:t xml:space="preserve">This whitepaper represents the current state of TELOS research and validation. Results are preliminary and subject to peer review. Implementation in production systems should follow appropriate testing and validation protocols.</w:t>
       </w:r>
     </w:p>
-    <w:bookmarkEnd w:id="137"/>
-    <w:bookmarkEnd w:id="138"/>
+    <w:bookmarkEnd w:id="142"/>
+    <w:bookmarkEnd w:id="143"/>
     <w:sectPr>
       <w:footnotePr>
         <w:numRestart w:val="eachSect"/>
@@ -25108,34 +26015,7 @@
     <w:abstractNumId w:val="991"/>
   </w:num>
   <w:num w:numId="1026">
-    <w:abstractNumId w:val="99411"/>
-    <w:lvlOverride w:ilvl="0">
-      <w:startOverride w:val="1"/>
-    </w:lvlOverride>
-    <w:lvlOverride w:ilvl="1">
-      <w:startOverride w:val="1"/>
-    </w:lvlOverride>
-    <w:lvlOverride w:ilvl="2">
-      <w:startOverride w:val="1"/>
-    </w:lvlOverride>
-    <w:lvlOverride w:ilvl="3">
-      <w:startOverride w:val="1"/>
-    </w:lvlOverride>
-    <w:lvlOverride w:ilvl="4">
-      <w:startOverride w:val="1"/>
-    </w:lvlOverride>
-    <w:lvlOverride w:ilvl="5">
-      <w:startOverride w:val="1"/>
-    </w:lvlOverride>
-    <w:lvlOverride w:ilvl="6">
-      <w:startOverride w:val="1"/>
-    </w:lvlOverride>
-    <w:lvlOverride w:ilvl="7">
-      <w:startOverride w:val="1"/>
-    </w:lvlOverride>
-    <w:lvlOverride w:ilvl="8">
-      <w:startOverride w:val="1"/>
-    </w:lvlOverride>
+    <w:abstractNumId w:val="991"/>
   </w:num>
   <w:num w:numId="1027">
     <w:abstractNumId w:val="99411"/>
@@ -25198,6 +26078,36 @@
     </w:lvlOverride>
   </w:num>
   <w:num w:numId="1029">
+    <w:abstractNumId w:val="99411"/>
+    <w:lvlOverride w:ilvl="0">
+      <w:startOverride w:val="1"/>
+    </w:lvlOverride>
+    <w:lvlOverride w:ilvl="1">
+      <w:startOverride w:val="1"/>
+    </w:lvlOverride>
+    <w:lvlOverride w:ilvl="2">
+      <w:startOverride w:val="1"/>
+    </w:lvlOverride>
+    <w:lvlOverride w:ilvl="3">
+      <w:startOverride w:val="1"/>
+    </w:lvlOverride>
+    <w:lvlOverride w:ilvl="4">
+      <w:startOverride w:val="1"/>
+    </w:lvlOverride>
+    <w:lvlOverride w:ilvl="5">
+      <w:startOverride w:val="1"/>
+    </w:lvlOverride>
+    <w:lvlOverride w:ilvl="6">
+      <w:startOverride w:val="1"/>
+    </w:lvlOverride>
+    <w:lvlOverride w:ilvl="7">
+      <w:startOverride w:val="1"/>
+    </w:lvlOverride>
+    <w:lvlOverride w:ilvl="8">
+      <w:startOverride w:val="1"/>
+    </w:lvlOverride>
+  </w:num>
+  <w:num w:numId="1030">
     <w:abstractNumId w:val="991"/>
   </w:num>
 </w:numbering>

</xml_diff>